<commit_message>
Deploy preview for PR 106 🛫
</commit_message>
<xml_diff>
--- a/pr-preview/pr-106/chapters/22-target-trial-emulation-tracked-changes.docx
+++ b/pr-preview/pr-106/chapters/22-target-trial-emulation-tracked-changes.docx
@@ -17295,37 +17295,55 @@
           <w:numId w:val="1022"/>
         </w:numPr>
       </w:pPr>
-      <w:r>
-        <w:t xml:space="preserve">A</w:t>
-      </w:r>
-      <w:r>
-        <w:t xml:space="preserve"> </w:t>
-      </w:r>
-      <w:r>
-        <w:rPr>
-          <w:b/>
-          <w:bCs/>
-        </w:rPr>
-        <w:t xml:space="preserve">target trial</w:t>
-      </w:r>
-      <w:r>
-        <w:t xml:space="preserve"> </w:t>
-      </w:r>
-      <w:r>
-        <w:t xml:space="preserve">protocol specifies eligibility, follow-up, strategies, outcomes,</w:t>
-      </w:r>
-      <w:r>
-        <w:t xml:space="preserve"> </w:t>
-      </w:r>
-      <w:r>
-        <w:t xml:space="preserve">causal contrast, and analysis plan;</w:t>
-      </w:r>
-      <w:r>
-        <w:t xml:space="preserve"> </w:t>
-      </w:r>
-      <w:r>
-        <w:t xml:space="preserve">observational analogs are the comparison of initiators (ITT) and the PP effect.</w:t>
-      </w:r>
+      <w:ins w:id="87" w:author="PR Preview" w:date="2024-01-01T00:00:00Z">
+        <w:r>
+          <w:t xml:space="preserve">A</w:t>
+        </w:r>
+      </w:ins>
+      <w:ins w:id="87" w:author="PR Preview" w:date="2024-01-01T00:00:00Z">
+        <w:r>
+          <w:t xml:space="preserve"> </w:t>
+        </w:r>
+      </w:ins>
+      <w:ins w:id="87" w:author="PR Preview" w:date="2024-01-01T00:00:00Z">
+        <w:r>
+          <w:rPr>
+            <w:b/>
+            <w:bCs/>
+          </w:rPr>
+          <w:t xml:space="preserve">target trial</w:t>
+        </w:r>
+      </w:ins>
+      <w:ins w:id="87" w:author="PR Preview" w:date="2024-01-01T00:00:00Z">
+        <w:r>
+          <w:t xml:space="preserve"> </w:t>
+        </w:r>
+      </w:ins>
+      <w:ins w:id="87" w:author="PR Preview" w:date="2024-01-01T00:00:00Z">
+        <w:r>
+          <w:t xml:space="preserve">protocol specifies eligibility, follow-up, strategies,</w:t>
+        </w:r>
+      </w:ins>
+      <w:ins w:id="87" w:author="PR Preview" w:date="2024-01-01T00:00:00Z">
+        <w:r>
+          <w:t xml:space="preserve"> </w:t>
+        </w:r>
+      </w:ins>
+      <w:ins w:id="87" w:author="PR Preview" w:date="2024-01-01T00:00:00Z">
+        <w:r>
+          <w:t xml:space="preserve">assignment procedures, outcomes, causal contrast, and analysis plan;</w:t>
+        </w:r>
+      </w:ins>
+      <w:ins w:id="87" w:author="PR Preview" w:date="2024-01-01T00:00:00Z">
+        <w:r>
+          <w:t xml:space="preserve"> </w:t>
+        </w:r>
+      </w:ins>
+      <w:ins w:id="87" w:author="PR Preview" w:date="2024-01-01T00:00:00Z">
+        <w:r>
+          <w:t xml:space="preserve">observational analogs are the comparison of initiators (ITT) and the PP effect.</w:t>
+        </w:r>
+      </w:ins>
     </w:p>
     <w:p>
       <w:pPr>

</xml_diff>